<commit_message>
Budget: coordinator at 5% FTE; add follow-on study options
Per PI: coordinator line recast at 5% FTE (2 hr/wk x 26 wk, $1,820 + fringe),
bringing the direct total to ~$20,700 (~$14,900 lean), with a note that the
hours flex around recruitment/payment bursts and the 25% FTE alternative
priced inline. Adds planning-level budgets for the two candidate follow-on
studies: a single-site intervention trial teaching skill-preserving AI
behaviors (~$29,300) and a 3-4 site replication (~$41,300). CSV mirrors all
three sections.

Co-Authored-By: Claude Opus 4.7 <noreply@anthropic.com>
</commit_message>
<xml_diff>
--- a/docs/Budget.docx
+++ b/docs/Budget.docx
@@ -2,7 +2,7 @@
 <file path=word/document.xml><?xml version="1.0" encoding="utf-8"?>
 <w:document xmlns:w="http://schemas.openxmlformats.org/wordprocessingml/2006/main" xmlns:m="http://schemas.openxmlformats.org/officeDocument/2006/math" xmlns:r="http://schemas.openxmlformats.org/officeDocument/2006/relationships" xmlns:o="urn:schemas-microsoft-com:office:office" xmlns:v="urn:schemas-microsoft-com:vml" xmlns:w10="urn:schemas-microsoft-com:office:word" xmlns:a="http://schemas.openxmlformats.org/drawingml/2006/main" xmlns:pic="http://schemas.openxmlformats.org/drawingml/2006/picture" xmlns:wp="http://schemas.openxmlformats.org/drawingml/2006/wordprocessingDrawing">
   <w:body>
-    <w:bookmarkStart w:id="10" w:name="budget-skill-ai-rct"/>
+    <w:bookmarkStart w:id="11" w:name="budget-skill-ai-rct"/>
     <w:p>
       <w:pPr>
         <w:pStyle w:val="Heading1"/>
@@ -16,7 +16,7 @@
         <w:pStyle w:val="FirstParagraph"/>
       </w:pPr>
       <w:r>
-        <w:t xml:space="preserve">Total request is approximately $29,100 in direct costs, or about $22,200 without the optional biostatistics and publication lines. The largest assumptions are a six-month coordinator period covering launch preparation through data closeout, and full enrollment of 100 residents. Both scale linearly and are itemized below so either can be adjusted.</w:t>
+        <w:t xml:space="preserve">Total request is approximately $20,700 in direct costs, or about $14,900 without the optional biostatistics and publication lines. The largest assumptions are a six-month coordinator period at 5% FTE covering launch preparation through data closeout, and full enrollment of 100 residents. Both scale linearly and are itemized so either can be adjusted. A planning-level budget for the follow-on study appears at the end in two versions.</w:t>
       </w:r>
     </w:p>
     <w:tbl>
@@ -123,18 +123,18 @@
               <w:pStyle w:val="Compact"/>
             </w:pPr>
             <w:r>
-              <w:t xml:space="preserve">$35/hr, 10 hr/wk, 26 weeks</w:t>
-            </w:r>
-          </w:p>
-        </w:tc>
-        <w:tc>
-          <w:tcPr/>
-          <w:p>
-            <w:pPr>
-              <w:pStyle w:val="Compact"/>
-            </w:pPr>
-            <w:r>
-              <w:t xml:space="preserve">$9,100</w:t>
+              <w:t xml:space="preserve">5% FTE (2 hr/wk at $35/hr, 26 weeks)</w:t>
+            </w:r>
+          </w:p>
+        </w:tc>
+        <w:tc>
+          <w:tcPr/>
+          <w:p>
+            <w:pPr>
+              <w:pStyle w:val="Compact"/>
+            </w:pPr>
+            <w:r>
+              <w:t xml:space="preserve">$1,820</w:t>
             </w:r>
           </w:p>
         </w:tc>
@@ -169,7 +169,7 @@
               <w:pStyle w:val="Compact"/>
             </w:pPr>
             <w:r>
-              <w:t xml:space="preserve">$910</w:t>
+              <w:t xml:space="preserve">$182</w:t>
             </w:r>
           </w:p>
         </w:tc>
@@ -379,7 +379,7 @@
               <w:pStyle w:val="Compact"/>
             </w:pPr>
             <w:r>
-              <w:t xml:space="preserve">$1,400</w:t>
+              <w:t xml:space="preserve">$1,000</w:t>
             </w:r>
           </w:p>
         </w:tc>
@@ -411,7 +411,7 @@
               <w:pStyle w:val="Compact"/>
             </w:pPr>
             <w:r>
-              <w:t xml:space="preserve">$29,080</w:t>
+              <w:t xml:space="preserve">$20,672</w:t>
             </w:r>
           </w:p>
         </w:tc>
@@ -446,7 +446,7 @@
               <w:pStyle w:val="Compact"/>
             </w:pPr>
             <w:r>
-              <w:t xml:space="preserve">$2,326</w:t>
+              <w:t xml:space="preserve">$1,654</w:t>
             </w:r>
           </w:p>
         </w:tc>
@@ -478,7 +478,7 @@
               <w:pStyle w:val="Compact"/>
             </w:pPr>
             <w:r>
-              <w:t xml:space="preserve">$31,406</w:t>
+              <w:t xml:space="preserve">$22,326</w:t>
             </w:r>
           </w:p>
         </w:tc>
@@ -506,7 +506,7 @@
         <w:pStyle w:val="BodyText"/>
       </w:pPr>
       <w:r>
-        <w:t xml:space="preserve">The coordinator covers recruitment and code distribution, completion monitoring, payment processing, per-batch data exports and quality checks, and assembly of the de-identified analysis dataset. Ten hours a week for six months is deliberately generous for an asynchronous single-site study; if enrollment completes quickly, four months (17 weeks, about $5,950 plus fringe) is realistic, and the fringe rate should be replaced with the actual rate for the hire’s classification.</w:t>
+        <w:t xml:space="preserve">The coordinator covers recruitment and code distribution, completion monitoring, payment processing, per-batch data exports and quality checks, and assembly of the de-identified analysis dataset. At 5% FTE the total is 52 hours across six months. Because the work arrives in bursts around recruitment waves and payment batches, the hours should be understood as flexing around those peaks rather than a flat two per week; if a steadier commitment is preferred, 10 hr/wk (25% FTE) raises the salary line to $9,100 plus fringe and the direct total to about $29,100.</w:t>
       </w:r>
     </w:p>
     <w:p>
@@ -514,7 +514,25 @@
         <w:pStyle w:val="BodyText"/>
       </w:pPr>
       <w:r>
-        <w:t xml:space="preserve">The interaction-pattern analysis requires two independent coders. If the second coder is a coauthor contributing effort in kind, the line can be dropped.</w:t>
+        <w:t xml:space="preserve">The interaction-pattern analysis requires two independent coders; if the second coder is a coauthor contributing effort in kind, the line can be dropped. AI usage is metered per conversation at roughly $7 to $15 per session, incurred only by the 50 AI-arm residents, with headroom for piloting. Hosting covers the study database and platform through analysis. UpToDate access is through the existing Lane Library license at no cost; IRB review (exempt), ClinicalTrials.gov, and OSF carry no fees; platform development was completed before this budget period and is not requested. The optional lines are judgment calls: the primary analysis is a pre-specified two-arm comparison the study team can run, but independent biostatistical review strengthens a submission to a high-visibility journal, and the publication line covers an open-access fee if the accepting journal charges one. Indirect costs depend on the funding mechanism and should be set to the sponsor’s rate.</w:t>
+      </w:r>
+    </w:p>
+    <w:bookmarkEnd w:id="9"/>
+    <w:bookmarkStart w:id="10" w:name="follow-on-study-options-planning-figures"/>
+    <w:p>
+      <w:pPr>
+        <w:pStyle w:val="Heading2"/>
+      </w:pPr>
+      <w:r>
+        <w:t xml:space="preserve">Follow-on study options (planning figures)</w:t>
+      </w:r>
+    </w:p>
+    <w:p>
+      <w:pPr>
+        <w:pStyle w:val="FirstParagraph"/>
+      </w:pPr>
+      <w:r>
+        <w:t xml:space="preserve">The present trial establishes whether an out-of-the-box assistant builds or bypasses knowledge. Two natural next studies follow, and the figures below are planning-level estimates for whichever is chosen, not committed budgets.</w:t>
       </w:r>
     </w:p>
     <w:p>
@@ -522,19 +540,756 @@
         <w:pStyle w:val="BodyText"/>
       </w:pPr>
       <w:r>
-        <w:t xml:space="preserve">AI usage is metered per conversation. A full session on the study model costs roughly $7 to $15 depending on conversation length, and only the 50 AI-arm residents incur it; the estimate includes headroom for piloting and QA. Hosting covers the study database and web platform through analysis. UpToDate access is through the existing Lane Library license at no cost, and IRB review (exempt), ClinicalTrials.gov, and OSF registration carry no fees. Platform development was completed before this budget period and is not requested.</w:t>
+        <w:rPr>
+          <w:b/>
+          <w:bCs/>
+        </w:rPr>
+        <w:t xml:space="preserve">Option A. Intervention trial: teaching skill-preserving AI behaviors (single site, n = 100).</w:t>
+      </w:r>
+      <w:r>
+        <w:t xml:space="preserve"> </w:t>
+      </w:r>
+      <w:r>
+        <w:t xml:space="preserve">Residents are randomized to a brief workshop teaching engaged interaction patterns or to a delayed-workshop control, and both arms then complete a case with the AI assistant followed by the resource-free assessment on the existing platform. Assumes a coordinator at 10 hr/wk for six months because workshop sessions must be scheduled into protected time.</w:t>
       </w:r>
     </w:p>
+    <w:tbl>
+      <w:tblPr>
+        <w:tblStyle w:val="Table"/>
+        <w:tblW w:type="pct" w:w="5000"/>
+        <w:tblLayout w:type="fixed"/>
+        <w:tblLook w:firstRow="1" w:lastRow="0" w:firstColumn="0" w:lastColumn="0" w:noHBand="0" w:noVBand="0" w:val="0020"/>
+      </w:tblPr>
+      <w:tblGrid>
+        <w:gridCol w:w="2640"/>
+        <w:gridCol w:w="2640"/>
+        <w:gridCol w:w="2640"/>
+      </w:tblGrid>
+      <w:tr>
+        <w:trPr>
+          <w:tblHeader w:val="on"/>
+        </w:trPr>
+        <w:tc>
+          <w:tcPr/>
+          <w:p>
+            <w:pPr>
+              <w:pStyle w:val="Compact"/>
+            </w:pPr>
+            <w:r>
+              <w:t xml:space="preserve">Line</w:t>
+            </w:r>
+          </w:p>
+        </w:tc>
+        <w:tc>
+          <w:tcPr/>
+          <w:p>
+            <w:pPr>
+              <w:pStyle w:val="Compact"/>
+            </w:pPr>
+            <w:r>
+              <w:t xml:space="preserve">Basis</w:t>
+            </w:r>
+          </w:p>
+        </w:tc>
+        <w:tc>
+          <w:tcPr/>
+          <w:p>
+            <w:pPr>
+              <w:pStyle w:val="Compact"/>
+            </w:pPr>
+            <w:r>
+              <w:t xml:space="preserve">Amount</w:t>
+            </w:r>
+          </w:p>
+        </w:tc>
+      </w:tr>
+      <w:tr>
+        <w:tc>
+          <w:tcPr/>
+          <w:p>
+            <w:pPr>
+              <w:pStyle w:val="Compact"/>
+            </w:pPr>
+            <w:r>
+              <w:t xml:space="preserve">Participant payments</w:t>
+            </w:r>
+          </w:p>
+        </w:tc>
+        <w:tc>
+          <w:tcPr/>
+          <w:p>
+            <w:pPr>
+              <w:pStyle w:val="Compact"/>
+            </w:pPr>
+            <w:r>
+              <w:t xml:space="preserve">100 at $100, plus $50 workshop supplement for the intervention arm</w:t>
+            </w:r>
+          </w:p>
+        </w:tc>
+        <w:tc>
+          <w:tcPr/>
+          <w:p>
+            <w:pPr>
+              <w:pStyle w:val="Compact"/>
+            </w:pPr>
+            <w:r>
+              <w:t xml:space="preserve">$12,500</w:t>
+            </w:r>
+          </w:p>
+        </w:tc>
+      </w:tr>
+      <w:tr>
+        <w:tc>
+          <w:tcPr/>
+          <w:p>
+            <w:pPr>
+              <w:pStyle w:val="Compact"/>
+            </w:pPr>
+            <w:r>
+              <w:t xml:space="preserve">Research coordinator</w:t>
+            </w:r>
+          </w:p>
+        </w:tc>
+        <w:tc>
+          <w:tcPr/>
+          <w:p>
+            <w:pPr>
+              <w:pStyle w:val="Compact"/>
+            </w:pPr>
+            <w:r>
+              <w:t xml:space="preserve">10 hr/wk at $35/hr, 26 weeks, plus 10% fringe</w:t>
+            </w:r>
+          </w:p>
+        </w:tc>
+        <w:tc>
+          <w:tcPr/>
+          <w:p>
+            <w:pPr>
+              <w:pStyle w:val="Compact"/>
+            </w:pPr>
+            <w:r>
+              <w:t xml:space="preserve">$10,010</w:t>
+            </w:r>
+          </w:p>
+        </w:tc>
+      </w:tr>
+      <w:tr>
+        <w:tc>
+          <w:tcPr/>
+          <w:p>
+            <w:pPr>
+              <w:pStyle w:val="Compact"/>
+            </w:pPr>
+            <w:r>
+              <w:t xml:space="preserve">Workshop materials and curriculum production</w:t>
+            </w:r>
+          </w:p>
+        </w:tc>
+        <w:tc>
+          <w:tcPr/>
+          <w:p>
+            <w:pPr>
+              <w:pStyle w:val="Compact"/>
+            </w:pPr>
+          </w:p>
+        </w:tc>
+        <w:tc>
+          <w:tcPr/>
+          <w:p>
+            <w:pPr>
+              <w:pStyle w:val="Compact"/>
+            </w:pPr>
+            <w:r>
+              <w:t xml:space="preserve">$500</w:t>
+            </w:r>
+          </w:p>
+        </w:tc>
+      </w:tr>
+      <w:tr>
+        <w:tc>
+          <w:tcPr/>
+          <w:p>
+            <w:pPr>
+              <w:pStyle w:val="Compact"/>
+            </w:pPr>
+            <w:r>
+              <w:t xml:space="preserve">AI model usage</w:t>
+            </w:r>
+          </w:p>
+        </w:tc>
+        <w:tc>
+          <w:tcPr/>
+          <w:p>
+            <w:pPr>
+              <w:pStyle w:val="Compact"/>
+            </w:pPr>
+            <w:r>
+              <w:t xml:space="preserve">both arms use the assistant during the case, ~100 sessions</w:t>
+            </w:r>
+          </w:p>
+        </w:tc>
+        <w:tc>
+          <w:tcPr/>
+          <w:p>
+            <w:pPr>
+              <w:pStyle w:val="Compact"/>
+            </w:pPr>
+            <w:r>
+              <w:t xml:space="preserve">$1,500</w:t>
+            </w:r>
+          </w:p>
+        </w:tc>
+      </w:tr>
+      <w:tr>
+        <w:tc>
+          <w:tcPr/>
+          <w:p>
+            <w:pPr>
+              <w:pStyle w:val="Compact"/>
+            </w:pPr>
+            <w:r>
+              <w:t xml:space="preserve">Hosting</w:t>
+            </w:r>
+          </w:p>
+        </w:tc>
+        <w:tc>
+          <w:tcPr/>
+          <w:p>
+            <w:pPr>
+              <w:pStyle w:val="Compact"/>
+            </w:pPr>
+          </w:p>
+        </w:tc>
+        <w:tc>
+          <w:tcPr/>
+          <w:p>
+            <w:pPr>
+              <w:pStyle w:val="Compact"/>
+            </w:pPr>
+            <w:r>
+              <w:t xml:space="preserve">$400</w:t>
+            </w:r>
+          </w:p>
+        </w:tc>
+      </w:tr>
+      <w:tr>
+        <w:tc>
+          <w:tcPr/>
+          <w:p>
+            <w:pPr>
+              <w:pStyle w:val="Compact"/>
+            </w:pPr>
+            <w:r>
+              <w:t xml:space="preserve">Second qualitative coder</w:t>
+            </w:r>
+          </w:p>
+        </w:tc>
+        <w:tc>
+          <w:tcPr/>
+          <w:p>
+            <w:pPr>
+              <w:pStyle w:val="Compact"/>
+            </w:pPr>
+            <w:r>
+              <w:t xml:space="preserve">~30 hr plus fringe; transcripts from both arms</w:t>
+            </w:r>
+          </w:p>
+        </w:tc>
+        <w:tc>
+          <w:tcPr/>
+          <w:p>
+            <w:pPr>
+              <w:pStyle w:val="Compact"/>
+            </w:pPr>
+            <w:r>
+              <w:t xml:space="preserve">$1,000</w:t>
+            </w:r>
+          </w:p>
+        </w:tc>
+      </w:tr>
+      <w:tr>
+        <w:tc>
+          <w:tcPr/>
+          <w:p>
+            <w:pPr>
+              <w:pStyle w:val="Compact"/>
+            </w:pPr>
+            <w:r>
+              <w:t xml:space="preserve">Biostatistics consultation</w:t>
+            </w:r>
+          </w:p>
+        </w:tc>
+        <w:tc>
+          <w:tcPr/>
+          <w:p>
+            <w:pPr>
+              <w:pStyle w:val="Compact"/>
+            </w:pPr>
+          </w:p>
+        </w:tc>
+        <w:tc>
+          <w:tcPr/>
+          <w:p>
+            <w:pPr>
+              <w:pStyle w:val="Compact"/>
+            </w:pPr>
+            <w:r>
+              <w:t xml:space="preserve">$2,000</w:t>
+            </w:r>
+          </w:p>
+        </w:tc>
+      </w:tr>
+      <w:tr>
+        <w:tc>
+          <w:tcPr/>
+          <w:p>
+            <w:pPr>
+              <w:pStyle w:val="Compact"/>
+            </w:pPr>
+            <w:r>
+              <w:t xml:space="preserve">Contingency</w:t>
+            </w:r>
+          </w:p>
+        </w:tc>
+        <w:tc>
+          <w:tcPr/>
+          <w:p>
+            <w:pPr>
+              <w:pStyle w:val="Compact"/>
+            </w:pPr>
+            <w:r>
+              <w:t xml:space="preserve">~5%</w:t>
+            </w:r>
+          </w:p>
+        </w:tc>
+        <w:tc>
+          <w:tcPr/>
+          <w:p>
+            <w:pPr>
+              <w:pStyle w:val="Compact"/>
+            </w:pPr>
+            <w:r>
+              <w:t xml:space="preserve">$1,400</w:t>
+            </w:r>
+          </w:p>
+        </w:tc>
+      </w:tr>
+      <w:tr>
+        <w:tc>
+          <w:tcPr/>
+          <w:p>
+            <w:pPr>
+              <w:pStyle w:val="Compact"/>
+            </w:pPr>
+            <w:r>
+              <w:t xml:space="preserve">Direct total</w:t>
+            </w:r>
+          </w:p>
+        </w:tc>
+        <w:tc>
+          <w:tcPr/>
+          <w:p>
+            <w:pPr>
+              <w:pStyle w:val="Compact"/>
+            </w:pPr>
+          </w:p>
+        </w:tc>
+        <w:tc>
+          <w:tcPr/>
+          <w:p>
+            <w:pPr>
+              <w:pStyle w:val="Compact"/>
+            </w:pPr>
+            <w:r>
+              <w:t xml:space="preserve">$29,310</w:t>
+            </w:r>
+          </w:p>
+        </w:tc>
+      </w:tr>
+    </w:tbl>
     <w:p>
       <w:pPr>
         <w:pStyle w:val="BodyText"/>
       </w:pPr>
       <w:r>
-        <w:t xml:space="preserve">The optional lines are judgment calls. The primary analysis is a pre-specified two-arm comparison that the study team can run, but independent biostatistical review strengthens a submission to a high-visibility journal; the publication line covers an open-access fee if the accepting journal charges one. Indirect costs depend entirely on the funding mechanism (departmental funds typically carry none; the 8% line mirrors internal-award templates) and should be set to the sponsor’s rate.</w:t>
+        <w:rPr>
+          <w:b/>
+          <w:bCs/>
+        </w:rPr>
+        <w:t xml:space="preserve">Option B. Multi-site replication of the present trial (3 to 4 sites, n = 150).</w:t>
+      </w:r>
+      <w:r>
+        <w:t xml:space="preserve"> </w:t>
+      </w:r>
+      <w:r>
+        <w:t xml:space="preserve">The same asynchronous protocol run at collaborating residency programs, which strengthens generalizability, the main limitation of the single-site design. Assumes a coordinator at 10 hr/wk for nine months to manage site onboarding, IRB reliance agreements, and cross-site data pooling; site leads are typically coauthors contributing effort in kind, with modest site stipends included.</w:t>
       </w:r>
     </w:p>
-    <w:bookmarkEnd w:id="9"/>
+    <w:tbl>
+      <w:tblPr>
+        <w:tblStyle w:val="Table"/>
+        <w:tblW w:type="pct" w:w="5000"/>
+        <w:tblLayout w:type="fixed"/>
+        <w:tblLook w:firstRow="1" w:lastRow="0" w:firstColumn="0" w:lastColumn="0" w:noHBand="0" w:noVBand="0" w:val="0020"/>
+      </w:tblPr>
+      <w:tblGrid>
+        <w:gridCol w:w="2640"/>
+        <w:gridCol w:w="2640"/>
+        <w:gridCol w:w="2640"/>
+      </w:tblGrid>
+      <w:tr>
+        <w:trPr>
+          <w:tblHeader w:val="on"/>
+        </w:trPr>
+        <w:tc>
+          <w:tcPr/>
+          <w:p>
+            <w:pPr>
+              <w:pStyle w:val="Compact"/>
+            </w:pPr>
+            <w:r>
+              <w:t xml:space="preserve">Line</w:t>
+            </w:r>
+          </w:p>
+        </w:tc>
+        <w:tc>
+          <w:tcPr/>
+          <w:p>
+            <w:pPr>
+              <w:pStyle w:val="Compact"/>
+            </w:pPr>
+            <w:r>
+              <w:t xml:space="preserve">Basis</w:t>
+            </w:r>
+          </w:p>
+        </w:tc>
+        <w:tc>
+          <w:tcPr/>
+          <w:p>
+            <w:pPr>
+              <w:pStyle w:val="Compact"/>
+            </w:pPr>
+            <w:r>
+              <w:t xml:space="preserve">Amount</w:t>
+            </w:r>
+          </w:p>
+        </w:tc>
+      </w:tr>
+      <w:tr>
+        <w:tc>
+          <w:tcPr/>
+          <w:p>
+            <w:pPr>
+              <w:pStyle w:val="Compact"/>
+            </w:pPr>
+            <w:r>
+              <w:t xml:space="preserve">Participant payments</w:t>
+            </w:r>
+          </w:p>
+        </w:tc>
+        <w:tc>
+          <w:tcPr/>
+          <w:p>
+            <w:pPr>
+              <w:pStyle w:val="Compact"/>
+            </w:pPr>
+            <w:r>
+              <w:t xml:space="preserve">150 at $100</w:t>
+            </w:r>
+          </w:p>
+        </w:tc>
+        <w:tc>
+          <w:tcPr/>
+          <w:p>
+            <w:pPr>
+              <w:pStyle w:val="Compact"/>
+            </w:pPr>
+            <w:r>
+              <w:t xml:space="preserve">$15,000</w:t>
+            </w:r>
+          </w:p>
+        </w:tc>
+      </w:tr>
+      <w:tr>
+        <w:tc>
+          <w:tcPr/>
+          <w:p>
+            <w:pPr>
+              <w:pStyle w:val="Compact"/>
+            </w:pPr>
+            <w:r>
+              <w:t xml:space="preserve">Research coordinator</w:t>
+            </w:r>
+          </w:p>
+        </w:tc>
+        <w:tc>
+          <w:tcPr/>
+          <w:p>
+            <w:pPr>
+              <w:pStyle w:val="Compact"/>
+            </w:pPr>
+            <w:r>
+              <w:t xml:space="preserve">10 hr/wk at $35/hr, 39 weeks, plus 10% fringe</w:t>
+            </w:r>
+          </w:p>
+        </w:tc>
+        <w:tc>
+          <w:tcPr/>
+          <w:p>
+            <w:pPr>
+              <w:pStyle w:val="Compact"/>
+            </w:pPr>
+            <w:r>
+              <w:t xml:space="preserve">$15,015</w:t>
+            </w:r>
+          </w:p>
+        </w:tc>
+      </w:tr>
+      <w:tr>
+        <w:tc>
+          <w:tcPr/>
+          <w:p>
+            <w:pPr>
+              <w:pStyle w:val="Compact"/>
+            </w:pPr>
+            <w:r>
+              <w:t xml:space="preserve">Site stipends</w:t>
+            </w:r>
+          </w:p>
+        </w:tc>
+        <w:tc>
+          <w:tcPr/>
+          <w:p>
+            <w:pPr>
+              <w:pStyle w:val="Compact"/>
+            </w:pPr>
+            <w:r>
+              <w:t xml:space="preserve">3 collaborating sites at $1,000</w:t>
+            </w:r>
+          </w:p>
+        </w:tc>
+        <w:tc>
+          <w:tcPr/>
+          <w:p>
+            <w:pPr>
+              <w:pStyle w:val="Compact"/>
+            </w:pPr>
+            <w:r>
+              <w:t xml:space="preserve">$3,000</w:t>
+            </w:r>
+          </w:p>
+        </w:tc>
+      </w:tr>
+      <w:tr>
+        <w:tc>
+          <w:tcPr/>
+          <w:p>
+            <w:pPr>
+              <w:pStyle w:val="Compact"/>
+            </w:pPr>
+            <w:r>
+              <w:t xml:space="preserve">AI model usage</w:t>
+            </w:r>
+          </w:p>
+        </w:tc>
+        <w:tc>
+          <w:tcPr/>
+          <w:p>
+            <w:pPr>
+              <w:pStyle w:val="Compact"/>
+            </w:pPr>
+            <w:r>
+              <w:t xml:space="preserve">~75 AI-arm sessions</w:t>
+            </w:r>
+          </w:p>
+        </w:tc>
+        <w:tc>
+          <w:tcPr/>
+          <w:p>
+            <w:pPr>
+              <w:pStyle w:val="Compact"/>
+            </w:pPr>
+            <w:r>
+              <w:t xml:space="preserve">$1,200</w:t>
+            </w:r>
+          </w:p>
+        </w:tc>
+      </w:tr>
+      <w:tr>
+        <w:tc>
+          <w:tcPr/>
+          <w:p>
+            <w:pPr>
+              <w:pStyle w:val="Compact"/>
+            </w:pPr>
+            <w:r>
+              <w:t xml:space="preserve">Hosting</w:t>
+            </w:r>
+          </w:p>
+        </w:tc>
+        <w:tc>
+          <w:tcPr/>
+          <w:p>
+            <w:pPr>
+              <w:pStyle w:val="Compact"/>
+            </w:pPr>
+            <w:r>
+              <w:t xml:space="preserve">12 months</w:t>
+            </w:r>
+          </w:p>
+        </w:tc>
+        <w:tc>
+          <w:tcPr/>
+          <w:p>
+            <w:pPr>
+              <w:pStyle w:val="Compact"/>
+            </w:pPr>
+            <w:r>
+              <w:t xml:space="preserve">$600</w:t>
+            </w:r>
+          </w:p>
+        </w:tc>
+      </w:tr>
+      <w:tr>
+        <w:tc>
+          <w:tcPr/>
+          <w:p>
+            <w:pPr>
+              <w:pStyle w:val="Compact"/>
+            </w:pPr>
+            <w:r>
+              <w:t xml:space="preserve">Second qualitative coder</w:t>
+            </w:r>
+          </w:p>
+        </w:tc>
+        <w:tc>
+          <w:tcPr/>
+          <w:p>
+            <w:pPr>
+              <w:pStyle w:val="Compact"/>
+            </w:pPr>
+            <w:r>
+              <w:t xml:space="preserve">~40 hr plus fringe</w:t>
+            </w:r>
+          </w:p>
+        </w:tc>
+        <w:tc>
+          <w:tcPr/>
+          <w:p>
+            <w:pPr>
+              <w:pStyle w:val="Compact"/>
+            </w:pPr>
+            <w:r>
+              <w:t xml:space="preserve">$1,540</w:t>
+            </w:r>
+          </w:p>
+        </w:tc>
+      </w:tr>
+      <w:tr>
+        <w:tc>
+          <w:tcPr/>
+          <w:p>
+            <w:pPr>
+              <w:pStyle w:val="Compact"/>
+            </w:pPr>
+            <w:r>
+              <w:t xml:space="preserve">Biostatistics consultation</w:t>
+            </w:r>
+          </w:p>
+        </w:tc>
+        <w:tc>
+          <w:tcPr/>
+          <w:p>
+            <w:pPr>
+              <w:pStyle w:val="Compact"/>
+            </w:pPr>
+            <w:r>
+              <w:t xml:space="preserve">site-effect models</w:t>
+            </w:r>
+          </w:p>
+        </w:tc>
+        <w:tc>
+          <w:tcPr/>
+          <w:p>
+            <w:pPr>
+              <w:pStyle w:val="Compact"/>
+            </w:pPr>
+            <w:r>
+              <w:t xml:space="preserve">$3,000</w:t>
+            </w:r>
+          </w:p>
+        </w:tc>
+      </w:tr>
+      <w:tr>
+        <w:tc>
+          <w:tcPr/>
+          <w:p>
+            <w:pPr>
+              <w:pStyle w:val="Compact"/>
+            </w:pPr>
+            <w:r>
+              <w:t xml:space="preserve">Contingency</w:t>
+            </w:r>
+          </w:p>
+        </w:tc>
+        <w:tc>
+          <w:tcPr/>
+          <w:p>
+            <w:pPr>
+              <w:pStyle w:val="Compact"/>
+            </w:pPr>
+            <w:r>
+              <w:t xml:space="preserve">~5%</w:t>
+            </w:r>
+          </w:p>
+        </w:tc>
+        <w:tc>
+          <w:tcPr/>
+          <w:p>
+            <w:pPr>
+              <w:pStyle w:val="Compact"/>
+            </w:pPr>
+            <w:r>
+              <w:t xml:space="preserve">$1,970</w:t>
+            </w:r>
+          </w:p>
+        </w:tc>
+      </w:tr>
+      <w:tr>
+        <w:tc>
+          <w:tcPr/>
+          <w:p>
+            <w:pPr>
+              <w:pStyle w:val="Compact"/>
+            </w:pPr>
+            <w:r>
+              <w:t xml:space="preserve">Direct total</w:t>
+            </w:r>
+          </w:p>
+        </w:tc>
+        <w:tc>
+          <w:tcPr/>
+          <w:p>
+            <w:pPr>
+              <w:pStyle w:val="Compact"/>
+            </w:pPr>
+          </w:p>
+        </w:tc>
+        <w:tc>
+          <w:tcPr/>
+          <w:p>
+            <w:pPr>
+              <w:pStyle w:val="Compact"/>
+            </w:pPr>
+            <w:r>
+              <w:t xml:space="preserve">$41,325</w:t>
+            </w:r>
+          </w:p>
+        </w:tc>
+      </w:tr>
+    </w:tbl>
     <w:bookmarkEnd w:id="10"/>
+    <w:bookmarkEnd w:id="11"/>
     <w:sectPr>
       <w:footnotePr>
         <w:numRestart w:val="eachSect"/>

</xml_diff>

<commit_message>
Budget: coordinator restored to 10 hr/wk; add PI salary at 5% FTE
Corrects a misread: 5% FTE is PI effort, not the coordinator. Coordinator
back at $35/hr x 10 hr/wk x 26 wk; new PI line at 5% FTE for the project
period against a labeled placeholder base ($250k) with 30% faculty fringe
and an NIH-cap note. Direct total ~$37,600 (~$31,800 lean). Follow-on
options now carry the same PI formula: intervention trial ~$37,800,
multi-site replication ~$54,100.

Co-Authored-By: Claude Opus 4.7 <noreply@anthropic.com>
</commit_message>
<xml_diff>
--- a/docs/Budget.docx
+++ b/docs/Budget.docx
@@ -16,7 +16,7 @@
         <w:pStyle w:val="FirstParagraph"/>
       </w:pPr>
       <w:r>
-        <w:t xml:space="preserve">Total request is approximately $20,700 in direct costs, or about $14,900 without the optional biostatistics and publication lines. The largest assumptions are a six-month coordinator period at 5% FTE covering launch preparation through data closeout, and full enrollment of 100 residents. Both scale linearly and are itemized so either can be adjusted. A planning-level budget for the follow-on study appears at the end in two versions.</w:t>
+        <w:t xml:space="preserve">Total request is approximately $37,600 in direct costs, or about $31,800 without the optional biostatistics and publication lines. The largest assumptions are a six-month project period, full enrollment of 100 residents, PI effort at 5% FTE against a placeholder base salary of $250,000, and a coordinator at 10 hr/wk. All scale linearly and are itemized so any can be adjusted. Planning-level budgets for the follow-on study appear at the end in two versions.</w:t>
       </w:r>
     </w:p>
     <w:tbl>
@@ -112,6 +112,76 @@
               <w:pStyle w:val="Compact"/>
             </w:pPr>
             <w:r>
+              <w:t xml:space="preserve">PI salary (Keet)</w:t>
+            </w:r>
+          </w:p>
+        </w:tc>
+        <w:tc>
+          <w:tcPr/>
+          <w:p>
+            <w:pPr>
+              <w:pStyle w:val="Compact"/>
+            </w:pPr>
+            <w:r>
+              <w:t xml:space="preserve">5% FTE for 6 months; placeholder base $250,000</w:t>
+            </w:r>
+          </w:p>
+        </w:tc>
+        <w:tc>
+          <w:tcPr/>
+          <w:p>
+            <w:pPr>
+              <w:pStyle w:val="Compact"/>
+            </w:pPr>
+            <w:r>
+              <w:t xml:space="preserve">$6,250</w:t>
+            </w:r>
+          </w:p>
+        </w:tc>
+      </w:tr>
+      <w:tr>
+        <w:tc>
+          <w:tcPr/>
+          <w:p>
+            <w:pPr>
+              <w:pStyle w:val="Compact"/>
+            </w:pPr>
+            <w:r>
+              <w:t xml:space="preserve">PI fringe</w:t>
+            </w:r>
+          </w:p>
+        </w:tc>
+        <w:tc>
+          <w:tcPr/>
+          <w:p>
+            <w:pPr>
+              <w:pStyle w:val="Compact"/>
+            </w:pPr>
+            <w:r>
+              <w:t xml:space="preserve">30% faculty placeholder; use the current institutional rate</w:t>
+            </w:r>
+          </w:p>
+        </w:tc>
+        <w:tc>
+          <w:tcPr/>
+          <w:p>
+            <w:pPr>
+              <w:pStyle w:val="Compact"/>
+            </w:pPr>
+            <w:r>
+              <w:t xml:space="preserve">$1,875</w:t>
+            </w:r>
+          </w:p>
+        </w:tc>
+      </w:tr>
+      <w:tr>
+        <w:tc>
+          <w:tcPr/>
+          <w:p>
+            <w:pPr>
+              <w:pStyle w:val="Compact"/>
+            </w:pPr>
+            <w:r>
               <w:t xml:space="preserve">Research coordinator</w:t>
             </w:r>
           </w:p>
@@ -123,18 +193,18 @@
               <w:pStyle w:val="Compact"/>
             </w:pPr>
             <w:r>
-              <w:t xml:space="preserve">5% FTE (2 hr/wk at $35/hr, 26 weeks)</w:t>
-            </w:r>
-          </w:p>
-        </w:tc>
-        <w:tc>
-          <w:tcPr/>
-          <w:p>
-            <w:pPr>
-              <w:pStyle w:val="Compact"/>
-            </w:pPr>
-            <w:r>
-              <w:t xml:space="preserve">$1,820</w:t>
+              <w:t xml:space="preserve">$35/hr, 10 hr/wk, 26 weeks</w:t>
+            </w:r>
+          </w:p>
+        </w:tc>
+        <w:tc>
+          <w:tcPr/>
+          <w:p>
+            <w:pPr>
+              <w:pStyle w:val="Compact"/>
+            </w:pPr>
+            <w:r>
+              <w:t xml:space="preserve">$9,100</w:t>
             </w:r>
           </w:p>
         </w:tc>
@@ -169,7 +239,7 @@
               <w:pStyle w:val="Compact"/>
             </w:pPr>
             <w:r>
-              <w:t xml:space="preserve">$182</w:t>
+              <w:t xml:space="preserve">$910</w:t>
             </w:r>
           </w:p>
         </w:tc>
@@ -379,7 +449,7 @@
               <w:pStyle w:val="Compact"/>
             </w:pPr>
             <w:r>
-              <w:t xml:space="preserve">$1,000</w:t>
+              <w:t xml:space="preserve">$1,790</w:t>
             </w:r>
           </w:p>
         </w:tc>
@@ -411,7 +481,7 @@
               <w:pStyle w:val="Compact"/>
             </w:pPr>
             <w:r>
-              <w:t xml:space="preserve">$20,672</w:t>
+              <w:t xml:space="preserve">$37,595</w:t>
             </w:r>
           </w:p>
         </w:tc>
@@ -446,7 +516,7 @@
               <w:pStyle w:val="Compact"/>
             </w:pPr>
             <w:r>
-              <w:t xml:space="preserve">$1,654</w:t>
+              <w:t xml:space="preserve">$3,008</w:t>
             </w:r>
           </w:p>
         </w:tc>
@@ -478,7 +548,7 @@
               <w:pStyle w:val="Compact"/>
             </w:pPr>
             <w:r>
-              <w:t xml:space="preserve">$22,326</w:t>
+              <w:t xml:space="preserve">$40,603</w:t>
             </w:r>
           </w:p>
         </w:tc>
@@ -506,7 +576,15 @@
         <w:pStyle w:val="BodyText"/>
       </w:pPr>
       <w:r>
-        <w:t xml:space="preserve">The coordinator covers recruitment and code distribution, completion monitoring, payment processing, per-batch data exports and quality checks, and assembly of the de-identified analysis dataset. At 5% FTE the total is 52 hours across six months. Because the work arrives in bursts around recruitment waves and payment batches, the hours should be understood as flexing around those peaks rather than a flat two per week; if a steadier commitment is preferred, 10 hr/wk (25% FTE) raises the salary line to $9,100 plus fringe and the direct total to about $29,100.</w:t>
+        <w:t xml:space="preserve">PI effort covers protocol oversight, clinical content ownership, IRB correspondence, recruitment liaison to the residency program, supervision of the qualitative coding, analysis, and manuscript preparation. The line is computed as 5% of institutional base salary for the six-month project period; replace the placeholder base and fringe rate with current figures, and note that federally funded budgets are subject to the NIH salary cap.</w:t>
+      </w:r>
+    </w:p>
+    <w:p>
+      <w:pPr>
+        <w:pStyle w:val="BodyText"/>
+      </w:pPr>
+      <w:r>
+        <w:t xml:space="preserve">The coordinator covers recruitment and code distribution, completion monitoring, payment processing, per-batch data exports and quality checks, and assembly of the de-identified analysis dataset. Ten hours a week for six months is deliberately generous for an asynchronous single-site study; if enrollment completes quickly, four months (about $5,950 plus fringe) is realistic.</w:t>
       </w:r>
     </w:p>
     <w:p>
@@ -532,7 +610,7 @@
         <w:pStyle w:val="FirstParagraph"/>
       </w:pPr>
       <w:r>
-        <w:t xml:space="preserve">The present trial establishes whether an out-of-the-box assistant builds or bypasses knowledge. Two natural next studies follow, and the figures below are planning-level estimates for whichever is chosen, not committed budgets.</w:t>
+        <w:t xml:space="preserve">The present trial establishes whether an out-of-the-box assistant builds or bypasses knowledge. Two natural next studies follow, and the figures below are planning-level estimates for whichever is chosen, not committed budgets. Both carry the same PI formula (5% FTE against the placeholder base, scaled to the project period).</w:t>
       </w:r>
     </w:p>
     <w:p>
@@ -544,13 +622,13 @@
           <w:b/>
           <w:bCs/>
         </w:rPr>
-        <w:t xml:space="preserve">Option A. Intervention trial: teaching skill-preserving AI behaviors (single site, n = 100).</w:t>
+        <w:t xml:space="preserve">Option A. Intervention trial: teaching skill-preserving AI behaviors (single site, n = 100, ~6 months).</w:t>
       </w:r>
       <w:r>
         <w:t xml:space="preserve"> </w:t>
       </w:r>
       <w:r>
-        <w:t xml:space="preserve">Residents are randomized to a brief workshop teaching engaged interaction patterns or to a delayed-workshop control, and both arms then complete a case with the AI assistant followed by the resource-free assessment on the existing platform. Assumes a coordinator at 10 hr/wk for six months because workshop sessions must be scheduled into protected time.</w:t>
+        <w:t xml:space="preserve">Residents are randomized to a brief workshop teaching engaged interaction patterns or to a delayed-workshop control, and both arms then complete a case with the AI assistant followed by the resource-free assessment on the existing platform. The coordinator remains at 10 hr/wk because workshop sessions must be scheduled into protected time.</w:t>
       </w:r>
     </w:p>
     <w:tbl>
@@ -646,6 +724,41 @@
               <w:pStyle w:val="Compact"/>
             </w:pPr>
             <w:r>
+              <w:t xml:space="preserve">PI salary and fringe</w:t>
+            </w:r>
+          </w:p>
+        </w:tc>
+        <w:tc>
+          <w:tcPr/>
+          <w:p>
+            <w:pPr>
+              <w:pStyle w:val="Compact"/>
+            </w:pPr>
+            <w:r>
+              <w:t xml:space="preserve">5% FTE, 6 months, placeholder base</w:t>
+            </w:r>
+          </w:p>
+        </w:tc>
+        <w:tc>
+          <w:tcPr/>
+          <w:p>
+            <w:pPr>
+              <w:pStyle w:val="Compact"/>
+            </w:pPr>
+            <w:r>
+              <w:t xml:space="preserve">$8,125</w:t>
+            </w:r>
+          </w:p>
+        </w:tc>
+      </w:tr>
+      <w:tr>
+        <w:tc>
+          <w:tcPr/>
+          <w:p>
+            <w:pPr>
+              <w:pStyle w:val="Compact"/>
+            </w:pPr>
+            <w:r>
               <w:t xml:space="preserve">Research coordinator</w:t>
             </w:r>
           </w:p>
@@ -869,7 +982,7 @@
               <w:pStyle w:val="Compact"/>
             </w:pPr>
             <w:r>
-              <w:t xml:space="preserve">$1,400</w:t>
+              <w:t xml:space="preserve">$1,800</w:t>
             </w:r>
           </w:p>
         </w:tc>
@@ -901,7 +1014,7 @@
               <w:pStyle w:val="Compact"/>
             </w:pPr>
             <w:r>
-              <w:t xml:space="preserve">$29,310</w:t>
+              <w:t xml:space="preserve">$37,835</w:t>
             </w:r>
           </w:p>
         </w:tc>
@@ -916,13 +1029,13 @@
           <w:b/>
           <w:bCs/>
         </w:rPr>
-        <w:t xml:space="preserve">Option B. Multi-site replication of the present trial (3 to 4 sites, n = 150).</w:t>
+        <w:t xml:space="preserve">Option B. Multi-site replication of the present trial (3 to 4 sites, n = 150, ~9 months).</w:t>
       </w:r>
       <w:r>
         <w:t xml:space="preserve"> </w:t>
       </w:r>
       <w:r>
-        <w:t xml:space="preserve">The same asynchronous protocol run at collaborating residency programs, which strengthens generalizability, the main limitation of the single-site design. Assumes a coordinator at 10 hr/wk for nine months to manage site onboarding, IRB reliance agreements, and cross-site data pooling; site leads are typically coauthors contributing effort in kind, with modest site stipends included.</w:t>
+        <w:t xml:space="preserve">The same asynchronous protocol run at collaborating residency programs, which strengthens generalizability, the main limitation of the single-site design. The coordinator runs 9 months for site onboarding, IRB reliance agreements, and cross-site pooling; site leads are typically coauthors contributing effort in kind, with modest site stipends included.</w:t>
       </w:r>
     </w:p>
     <w:tbl>
@@ -1018,6 +1131,41 @@
               <w:pStyle w:val="Compact"/>
             </w:pPr>
             <w:r>
+              <w:t xml:space="preserve">PI salary and fringe</w:t>
+            </w:r>
+          </w:p>
+        </w:tc>
+        <w:tc>
+          <w:tcPr/>
+          <w:p>
+            <w:pPr>
+              <w:pStyle w:val="Compact"/>
+            </w:pPr>
+            <w:r>
+              <w:t xml:space="preserve">5% FTE, 9 months, placeholder base</w:t>
+            </w:r>
+          </w:p>
+        </w:tc>
+        <w:tc>
+          <w:tcPr/>
+          <w:p>
+            <w:pPr>
+              <w:pStyle w:val="Compact"/>
+            </w:pPr>
+            <w:r>
+              <w:t xml:space="preserve">$12,188</w:t>
+            </w:r>
+          </w:p>
+        </w:tc>
+      </w:tr>
+      <w:tr>
+        <w:tc>
+          <w:tcPr/>
+          <w:p>
+            <w:pPr>
+              <w:pStyle w:val="Compact"/>
+            </w:pPr>
+            <w:r>
               <w:t xml:space="preserve">Research coordinator</w:t>
             </w:r>
           </w:p>
@@ -1250,7 +1398,7 @@
               <w:pStyle w:val="Compact"/>
             </w:pPr>
             <w:r>
-              <w:t xml:space="preserve">$1,970</w:t>
+              <w:t xml:space="preserve">$2,577</w:t>
             </w:r>
           </w:p>
         </w:tc>
@@ -1282,7 +1430,7 @@
               <w:pStyle w:val="Compact"/>
             </w:pPr>
             <w:r>
-              <w:t xml:space="preserve">$41,325</w:t>
+              <w:t xml:space="preserve">$54,120</w:t>
             </w:r>
           </w:p>
         </w:tc>

</xml_diff>